<commit_message>
Run full model; generate report docs and figures; update Word references
Model run results (T=52 weeks, all 5 scenarios):
  S1 PTA Shock        IO loss £1.410bn  welfare £-3.582bn
  S2 MEG Disruption   IO loss £0.143bn  welfare £-0.403bn
  S3 Geopolitical     IO loss £0.446bn  welfare £-1.044bn
  S4 Port Closure     IO loss £0.391bn  welfare £-0.946bn
  S5 Pandemic         IO loss £2.429bn  welfare £-6.342bn
Validation MAE: 4.84% across 7 historical events (all directions correct)

report/Polyester_Supply_Chain_Report.docx    — full narrative report
report/Polyester_Technical_Appendix.docx     — technical appendix
report/figures/fig_01..fig_10.png            — 10 publication figures

Model_Pseudocode_Reference.docx — sections 7.5-7.8 updated
  (rebuild_abm, P1-P5 policies, Armington sigma overrides, ABM demand feedback)
Model_Methodology.docx — sections 11-11.4 already present, unchanged

Co-Authored-By: Claude Sonnet 4.6 <noreply@anthropic.com>
</commit_message>
<xml_diff>
--- a/Model_Pseudocode_Reference.docx
+++ b/Model_Pseudocode_Reference.docx
@@ -7146,6 +7146,476 @@
           <w:color w:val="94A3B8"/>
         </w:rPr>
       </w:r>
+    </w:p>
+    <w:p>
+      <w:r/>
+    </w:p>
+    <w:p>
+      <w:r>
+        <w:t>7.5  Per-Sector Firm Configuration  (rebuild_abm)</w:t>
+      </w:r>
+    </w:p>
+    <w:p>
+      <w:r>
+        <w:t>FUNCTION rebuild_abm(agents_per_sector):</w:t>
+      </w:r>
+    </w:p>
+    <w:p>
+      <w:r>
+        <w:t xml:space="preserve">  // agents_per_sector: int (all stages) or list[int] (one per stage)</w:t>
+      </w:r>
+    </w:p>
+    <w:p>
+      <w:r>
+        <w:t xml:space="preserve">  // Maximum values: [6, 6, 5, 5, 5, 11, 2, 1]</w:t>
+      </w:r>
+    </w:p>
+    <w:p>
+      <w:r>
+        <w:t xml:space="preserve">  //   (Oil, Chem, PTA, PET, Fab, Gar, Who, Ret — from STAGE_GEOGRAPHY)</w:t>
+      </w:r>
+    </w:p>
+    <w:p>
+      <w:r>
+        <w:t xml:space="preserve">  self.abm &lt;- PolyesterSupplyChainABM(agents_per_sector)</w:t>
+      </w:r>
+    </w:p>
+    <w:p>
+      <w:r>
+        <w:t xml:space="preserve">  FOR s IN 0..N_SECTORS-1:</w:t>
+      </w:r>
+    </w:p>
+    <w:p>
+      <w:r>
+        <w:t xml:space="preserve">    self._abm_baseline_orders[s] &lt;- sum(ag.base_capacity for ag in abm.agents[s])</w:t>
+      </w:r>
+    </w:p>
+    <w:p>
+      <w:r>
+        <w:t xml:space="preserve">  // _abm_baseline_orders normalises the EMA demand-feedback path.</w:t>
+      </w:r>
+    </w:p>
+    <w:p>
+      <w:r/>
+    </w:p>
+    <w:p>
+      <w:r>
+        <w:t>7.6  UK Government Policy Interventions  (policies.py + _apply_policy_to_abm)</w:t>
+      </w:r>
+    </w:p>
+    <w:p>
+      <w:r>
+        <w:t>STRUCT Policy:</w:t>
+      </w:r>
+    </w:p>
+    <w:p>
+      <w:r>
+        <w:t xml:space="preserve">  buffer_sectors    : {sector -&gt; multiplier}</w:t>
+      </w:r>
+    </w:p>
+    <w:p>
+      <w:r>
+        <w:t xml:space="preserve">                       Scale ABM safety_stock and initial inventory at start.</w:t>
+      </w:r>
+    </w:p>
+    <w:p>
+      <w:r>
+        <w:t xml:space="preserve">  diversify_sectors : {sector -&gt; divert_fraction}</w:t>
+      </w:r>
+    </w:p>
+    <w:p>
+      <w:r>
+        <w:t xml:space="preserve">                       Shift divert_fraction of China base_capacity to others.</w:t>
+      </w:r>
+    </w:p>
+    <w:p>
+      <w:r>
+        <w:t xml:space="preserve">                       freed &lt;- sum(china_ag.base_capacity * divert)</w:t>
+      </w:r>
+    </w:p>
+    <w:p>
+      <w:r>
+        <w:t xml:space="preserve">                       other_ag.base_capacity += freed * (ag_share / total_other)</w:t>
+      </w:r>
+    </w:p>
+    <w:p>
+      <w:r>
+        <w:t xml:space="preserve">  recovery_boost    : {sector -&gt; rate_multiplier}</w:t>
+      </w:r>
+    </w:p>
+    <w:p>
+      <w:r>
+        <w:t xml:space="preserve">                       Multiplier on IO per-sector capacity-recovery rate.</w:t>
+      </w:r>
+    </w:p>
+    <w:p>
+      <w:r>
+        <w:t xml:space="preserve">  reserve_release   : {sector -&gt; capacity_boost_fraction}</w:t>
+      </w:r>
+    </w:p>
+    <w:p>
+      <w:r>
+        <w:t xml:space="preserve">                       Extra capacity from (onset + delay) for duration weeks.</w:t>
+      </w:r>
+    </w:p>
+    <w:p>
+      <w:r>
+        <w:t xml:space="preserve">  release_delay_weeks     : int  (default 2)</w:t>
+      </w:r>
+    </w:p>
+    <w:p>
+      <w:r>
+        <w:t xml:space="preserve">  release_duration_weeks  : int  (default 8)</w:t>
+      </w:r>
+    </w:p>
+    <w:p>
+      <w:r>
+        <w:t xml:space="preserve">  cost_estimate_gbp_m     : float  (display only)</w:t>
+      </w:r>
+    </w:p>
+    <w:p>
+      <w:r/>
+    </w:p>
+    <w:p>
+      <w:r>
+        <w:t>POLICIES:</w:t>
+      </w:r>
+    </w:p>
+    <w:p>
+      <w:r>
+        <w:t xml:space="preserve">  P1 – Strategic Buffer Stockpile         £120m/yr</w:t>
+      </w:r>
+    </w:p>
+    <w:p>
+      <w:r>
+        <w:t xml:space="preserve">       buffer_sectors: PTA×2.0, PET×2.0, Fabric×1.5, Garment×1.5</w:t>
+      </w:r>
+    </w:p>
+    <w:p>
+      <w:r>
+        <w:t xml:space="preserve">  P2 – Import Diversification Support      £45m/yr</w:t>
+      </w:r>
+    </w:p>
+    <w:p>
+      <w:r>
+        <w:t xml:space="preserve">       diversify_sectors: PTA 25%, PET 25%, Fabric 25%, Garment 20%</w:t>
+      </w:r>
+    </w:p>
+    <w:p>
+      <w:r>
+        <w:t xml:space="preserve">  P3 – Emergency Recovery Investment       £200m/yr</w:t>
+      </w:r>
+    </w:p>
+    <w:p>
+      <w:r>
+        <w:t xml:space="preserve">       recovery_boost: Chem, PTA, PET, Fabric, Garment all ×2.0</w:t>
+      </w:r>
+    </w:p>
+    <w:p>
+      <w:r>
+        <w:t xml:space="preserve">  P4 – Critical Material Reserve Release   £350m/yr</w:t>
+      </w:r>
+    </w:p>
+    <w:p>
+      <w:r>
+        <w:t xml:space="preserve">       reserve_release: PTA +25%, PET +15%, Chem +10%; delay=2wk, dur=8wk</w:t>
+      </w:r>
+    </w:p>
+    <w:p>
+      <w:r>
+        <w:t xml:space="preserve">  P5 – Integrated Resilience Package       £180m/yr</w:t>
+      </w:r>
+    </w:p>
+    <w:p>
+      <w:r>
+        <w:t xml:space="preserve">       buffer×1.5, diversify 15%, recovery×1.5, PTA+15%/PET+10% reserve</w:t>
+      </w:r>
+    </w:p>
+    <w:p>
+      <w:r/>
+    </w:p>
+    <w:p>
+      <w:r>
+        <w:t>FUNCTION _apply_policy_to_abm(policy):</w:t>
+      </w:r>
+    </w:p>
+    <w:p>
+      <w:r>
+        <w:t xml:space="preserve">  FOR (sector, mult) IN policy.buffer_sectors:</w:t>
+      </w:r>
+    </w:p>
+    <w:p>
+      <w:r>
+        <w:t xml:space="preserve">    FOR ag IN abm.agents[sector]:</w:t>
+      </w:r>
+    </w:p>
+    <w:p>
+      <w:r>
+        <w:t xml:space="preserve">      ag.safety_stock &lt;- ag.safety_stock * mult</w:t>
+      </w:r>
+    </w:p>
+    <w:p>
+      <w:r>
+        <w:t xml:space="preserve">      ag.inventory    &lt;- ag.inventory    * mult</w:t>
+      </w:r>
+    </w:p>
+    <w:p>
+      <w:r>
+        <w:t xml:space="preserve">  FOR (sector, divert) IN policy.diversify_sectors:</w:t>
+      </w:r>
+    </w:p>
+    <w:p>
+      <w:r>
+        <w:t xml:space="preserve">    freed &lt;- sum(china_ag.base_capacity * divert for china_ag in sector)</w:t>
+      </w:r>
+    </w:p>
+    <w:p>
+      <w:r>
+        <w:t xml:space="preserve">    FOR china_ag:  china_ag.base_capacity *= (1 - divert)</w:t>
+      </w:r>
+    </w:p>
+    <w:p>
+      <w:r>
+        <w:t xml:space="preserve">    FOR other_ag:  other_ag.base_capacity += freed * (share / total_other)</w:t>
+      </w:r>
+    </w:p>
+    <w:p>
+      <w:r>
+        <w:t xml:space="preserve">  RECOMPUTE _abm_baseline_orders</w:t>
+      </w:r>
+    </w:p>
+    <w:p>
+      <w:r/>
+    </w:p>
+    <w:p>
+      <w:r>
+        <w:t>FUNCTION run_coupled(scenario, T, policy=None, ...):</w:t>
+      </w:r>
+    </w:p>
+    <w:p>
+      <w:r>
+        <w:t xml:space="preserve">  _apply_policy_to_abm(policy)</w:t>
+      </w:r>
+    </w:p>
+    <w:p>
+      <w:r>
+        <w:t xml:space="preserve">  rec_mult    &lt;- _policy_rec_mult(policy)    // per-sector recovery multipliers</w:t>
+      </w:r>
+    </w:p>
+    <w:p>
+      <w:r>
+        <w:t xml:space="preserve">  res_sched   &lt;- _reserve_schedule(policy, onset, T)  // (T x N) capacity boosts</w:t>
+      </w:r>
+    </w:p>
+    <w:p>
+      <w:r>
+        <w:t xml:space="preserve">  FOR t = 1 TO T:</w:t>
+      </w:r>
+    </w:p>
+    <w:p>
+      <w:r>
+        <w:t xml:space="preserve">    cap_t &lt;- base_cap * recovery_t + res_sched[t]   // policy reserve injected here</w:t>
+      </w:r>
+    </w:p>
+    <w:p>
+      <w:r>
+        <w:t xml:space="preserve">    ...  // rest of per-period coupled loop as in 7.3</w:t>
+      </w:r>
+    </w:p>
+    <w:p>
+      <w:r/>
+    </w:p>
+    <w:p>
+      <w:r>
+        <w:t>7.7  Armington Elasticity Sigma Overrides  (validation events V3, V5)</w:t>
+      </w:r>
+    </w:p>
+    <w:p>
+      <w:r>
+        <w:t>// GTAP long-run elasticities underestimate short-run price spikes in</w:t>
+      </w:r>
+    </w:p>
+    <w:p>
+      <w:r>
+        <w:t>// concentrated markets. Per-event overrides are merged into GTAP defaults.</w:t>
+      </w:r>
+    </w:p>
+    <w:p>
+      <w:r/>
+    </w:p>
+    <w:p>
+      <w:r>
+        <w:t>CGEModel(sigma=sigma_override):</w:t>
+      </w:r>
+    </w:p>
+    <w:p>
+      <w:r>
+        <w:t xml:space="preserve">  self.sigma &lt;- {s: ARMINGTON_ELASTICITY[s] for s in SECTORS}   // GTAP baseline</w:t>
+      </w:r>
+    </w:p>
+    <w:p>
+      <w:r>
+        <w:t xml:space="preserve">  self.sigma.update(sigma_override)                              // event override</w:t>
+      </w:r>
+    </w:p>
+    <w:p>
+      <w:r/>
+    </w:p>
+    <w:p>
+      <w:r>
+        <w:t>Event V3 (PTA Production Disruption):</w:t>
+      </w:r>
+    </w:p>
+    <w:p>
+      <w:r>
+        <w:t xml:space="preserve">  sigma_override = {</w:t>
+      </w:r>
+    </w:p>
+    <w:p>
+      <w:r>
+        <w:t xml:space="preserve">    'PTA_Production': 0.50,   // GTAP 1.20; 4-firm oligopoly, no substitutes</w:t>
+      </w:r>
+    </w:p>
+    <w:p>
+      <w:r>
+        <w:t xml:space="preserve">                              // calibrated: 35% supply -&gt; ~+120% price (Bloomberg)</w:t>
+      </w:r>
+    </w:p>
+    <w:p>
+      <w:r>
+        <w:t xml:space="preserve">    'PET_Resin_Yarn': 0.80,   // locked-in PTA feedstock dependency</w:t>
+      </w:r>
+    </w:p>
+    <w:p>
+      <w:r>
+        <w:t xml:space="preserve">  }</w:t>
+      </w:r>
+    </w:p>
+    <w:p>
+      <w:r/>
+    </w:p>
+    <w:p>
+      <w:r>
+        <w:t>Event V5 (Red Sea Disruption):</w:t>
+      </w:r>
+    </w:p>
+    <w:p>
+      <w:r>
+        <w:t xml:space="preserve">  sigma_override = {</w:t>
+      </w:r>
+    </w:p>
+    <w:p>
+      <w:r>
+        <w:t xml:space="preserve">    'Chemical_Processing': 0.80,  // GTAP 3.65; all MEG sea lanes share</w:t>
+      </w:r>
+    </w:p>
+    <w:p>
+      <w:r>
+        <w:t xml:space="preserve">                                   // Cape detour simultaneously</w:t>
+      </w:r>
+    </w:p>
+    <w:p>
+      <w:r>
+        <w:t xml:space="preserve">                                   // calibrated: supply=0.93 -&gt; ~+10% MEG</w:t>
+      </w:r>
+    </w:p>
+    <w:p>
+      <w:r>
+        <w:t xml:space="preserve">                                   // (ICIS MEG Europe Jan-Mar 2024)</w:t>
+      </w:r>
+    </w:p>
+    <w:p>
+      <w:r>
+        <w:t xml:space="preserve">  }</w:t>
+      </w:r>
+    </w:p>
+    <w:p>
+      <w:r/>
+    </w:p>
+    <w:p>
+      <w:r>
+        <w:t>FUNCTION run_validation_event(event):</w:t>
+      </w:r>
+    </w:p>
+    <w:p>
+      <w:r>
+        <w:t xml:space="preserve">  sigma_override &lt;- event.get('sigma_override', None)</w:t>
+      </w:r>
+    </w:p>
+    <w:p>
+      <w:r>
+        <w:t xml:space="preserve">  cge &lt;- CGEModel(sigma=sigma_override) IF sigma_override ELSE CGEModel()</w:t>
+      </w:r>
+    </w:p>
+    <w:p>
+      <w:r/>
+    </w:p>
+    <w:p>
+      <w:r>
+        <w:t>7.8  ABM -&gt; CGE Demand Feedback  (abm_demand_feedback)</w:t>
+      </w:r>
+    </w:p>
+    <w:p>
+      <w:r>
+        <w:t>// EMA-smoothed ABM order volumes injected as CGE demand multipliers.</w:t>
+      </w:r>
+    </w:p>
+    <w:p>
+      <w:r>
+        <w:t>// Enabled by abm_demand_feedback=True in run_coupled / run_coupled_gs.</w:t>
+      </w:r>
+    </w:p>
+    <w:p>
+      <w:r>
+        <w:t>// Default: False (preserves comparability with standalone CGE runs).</w:t>
+      </w:r>
+    </w:p>
+    <w:p>
+      <w:r/>
+    </w:p>
+    <w:p>
+      <w:r>
+        <w:t>FUNCTION _abm_to_demand_mults(abm_orders_t, ema_prev):</w:t>
+      </w:r>
+    </w:p>
+    <w:p>
+      <w:r>
+        <w:t xml:space="preserve">  raw[s]     &lt;- sum(ag.orders[t] for ag in abm.agents[s])</w:t>
+      </w:r>
+    </w:p>
+    <w:p>
+      <w:r>
+        <w:t xml:space="preserve">  norm[s]    &lt;- raw[s] / _abm_baseline_orders[s]</w:t>
+      </w:r>
+    </w:p>
+    <w:p>
+      <w:r>
+        <w:t xml:space="preserve">  ema_t      &lt;- 0.10 * norm + 0.90 * ema_prev   // alpha=0.10</w:t>
+      </w:r>
+    </w:p>
+    <w:p>
+      <w:r>
+        <w:t xml:space="preserve">  RETURN ema_t   // passed as demand_shocks to cge.equilibrium()</w:t>
+      </w:r>
+    </w:p>
+    <w:p>
+      <w:r/>
+    </w:p>
+    <w:p>
+      <w:r>
+        <w:t>// alpha=0.10 damps Beer-Game bullwhip spikes while preserving persistent</w:t>
+      </w:r>
+    </w:p>
+    <w:p>
+      <w:r>
+        <w:t>// demand shifts from multi-week disruptions.</w:t>
+      </w:r>
+    </w:p>
+    <w:p>
+      <w:r/>
+    </w:p>
+    <w:p>
+      <w:r/>
     </w:p>
     <w:p>
       <w:r/>

</xml_diff>